<commit_message>
Update CV and cover letter templates
</commit_message>
<xml_diff>
--- a/templates/cover_letter_template.docx
+++ b/templates/cover_letter_template.docx
@@ -36,11 +36,21 @@
         <w:rPr>
           <w:noProof/>
         </w:rPr>
-        <w:t>6 January 2026</w:t>
+        <w:t>7 January 2026</w:t>
       </w:r>
       <w:r>
         <w:fldChar w:fldCharType="end"/>
       </w:r>
+    </w:p>
+    <w:p>
+      <w:pPr>
+        <w:spacing w:after="0"/>
+        <w:jc w:val="center"/>
+        <w:rPr>
+          <w:b/>
+          <w:bCs/>
+        </w:rPr>
+      </w:pPr>
     </w:p>
     <w:p>
       <w:pPr>
@@ -66,10 +76,33 @@
     <w:p>
       <w:pPr>
         <w:spacing w:after="0"/>
+        <w:jc w:val="center"/>
+        <w:rPr>
+          <w:b/>
+          <w:bCs/>
+        </w:rPr>
+      </w:pPr>
+    </w:p>
+    <w:p>
+      <w:pPr>
+        <w:spacing w:after="0"/>
+        <w:rPr>
+          <w:rFonts w:eastAsia="SimSun"/>
+          <w:lang w:eastAsia="zh-CN"/>
+        </w:rPr>
       </w:pPr>
       <w:r>
         <w:t>{{COVER_LETTER_BODY}}</w:t>
       </w:r>
+    </w:p>
+    <w:p>
+      <w:pPr>
+        <w:spacing w:after="0"/>
+        <w:rPr>
+          <w:rFonts w:eastAsia="SimSun" w:hint="eastAsia"/>
+          <w:lang w:eastAsia="zh-CN"/>
+        </w:rPr>
+      </w:pPr>
     </w:p>
     <w:p>
       <w:pPr>
@@ -83,8 +116,13 @@
       <w:pPr>
         <w:spacing w:after="0"/>
       </w:pPr>
+      <w:proofErr w:type="spellStart"/>
       <w:r>
-        <w:t>Xiaoxuan Li</w:t>
+        <w:t>Xiaoxuan</w:t>
+      </w:r>
+      <w:proofErr w:type="spellEnd"/>
+      <w:r>
+        <w:t xml:space="preserve"> Li</w:t>
       </w:r>
     </w:p>
     <w:p>

</xml_diff>

<commit_message>
Update app logic and all templates
</commit_message>
<xml_diff>
--- a/templates/cover_letter_template.docx
+++ b/templates/cover_letter_template.docx
@@ -5,16 +5,32 @@
     <w:p>
       <w:pPr>
         <w:spacing w:after="0"/>
+        <w:rPr>
+          <w:sz w:val="21"/>
+          <w:szCs w:val="21"/>
+        </w:rPr>
       </w:pPr>
       <w:r>
+        <w:rPr>
+          <w:sz w:val="21"/>
+          <w:szCs w:val="21"/>
+        </w:rPr>
         <w:t>{{COMPANY}}</w:t>
       </w:r>
     </w:p>
     <w:p>
       <w:pPr>
         <w:spacing w:after="0"/>
+        <w:rPr>
+          <w:sz w:val="21"/>
+          <w:szCs w:val="21"/>
+        </w:rPr>
       </w:pPr>
       <w:r>
+        <w:rPr>
+          <w:sz w:val="21"/>
+          <w:szCs w:val="21"/>
+        </w:rPr>
         <w:t>Berlin, Germany</w:t>
       </w:r>
     </w:p>
@@ -22,23 +38,45 @@
       <w:pPr>
         <w:spacing w:after="0"/>
         <w:jc w:val="right"/>
+        <w:rPr>
+          <w:sz w:val="21"/>
+          <w:szCs w:val="21"/>
+        </w:rPr>
       </w:pPr>
       <w:r>
+        <w:rPr>
+          <w:sz w:val="21"/>
+          <w:szCs w:val="21"/>
+        </w:rPr>
         <w:fldChar w:fldCharType="begin"/>
       </w:r>
       <w:r>
+        <w:rPr>
+          <w:sz w:val="21"/>
+          <w:szCs w:val="21"/>
+        </w:rPr>
         <w:instrText xml:space="preserve"> DATE \@ "d MMMM yyyy" </w:instrText>
       </w:r>
       <w:r>
+        <w:rPr>
+          <w:sz w:val="21"/>
+          <w:szCs w:val="21"/>
+        </w:rPr>
         <w:fldChar w:fldCharType="separate"/>
       </w:r>
       <w:r>
         <w:rPr>
           <w:noProof/>
+          <w:sz w:val="21"/>
+          <w:szCs w:val="21"/>
         </w:rPr>
-        <w:t>7 January 2026</w:t>
+        <w:t>8 January 2026</w:t>
       </w:r>
       <w:r>
+        <w:rPr>
+          <w:sz w:val="21"/>
+          <w:szCs w:val="21"/>
+        </w:rPr>
         <w:fldChar w:fldCharType="end"/>
       </w:r>
     </w:p>
@@ -49,6 +87,8 @@
         <w:rPr>
           <w:b/>
           <w:bCs/>
+          <w:sz w:val="21"/>
+          <w:szCs w:val="21"/>
         </w:rPr>
       </w:pPr>
     </w:p>
@@ -80,6 +120,8 @@
         <w:rPr>
           <w:b/>
           <w:bCs/>
+          <w:sz w:val="21"/>
+          <w:szCs w:val="21"/>
         </w:rPr>
       </w:pPr>
     </w:p>
@@ -88,10 +130,16 @@
         <w:spacing w:after="0"/>
         <w:rPr>
           <w:rFonts w:eastAsia="SimSun"/>
+          <w:sz w:val="21"/>
+          <w:szCs w:val="21"/>
           <w:lang w:eastAsia="zh-CN"/>
         </w:rPr>
       </w:pPr>
       <w:r>
+        <w:rPr>
+          <w:sz w:val="21"/>
+          <w:szCs w:val="21"/>
+        </w:rPr>
         <w:t>{{COVER_LETTER_BODY}}</w:t>
       </w:r>
     </w:p>
@@ -99,7 +147,9 @@
       <w:pPr>
         <w:spacing w:after="0"/>
         <w:rPr>
-          <w:rFonts w:eastAsia="SimSun" w:hint="eastAsia"/>
+          <w:rFonts w:eastAsia="SimSun"/>
+          <w:sz w:val="21"/>
+          <w:szCs w:val="21"/>
           <w:lang w:eastAsia="zh-CN"/>
         </w:rPr>
       </w:pPr>
@@ -107,21 +157,41 @@
     <w:p>
       <w:pPr>
         <w:spacing w:after="0"/>
+        <w:rPr>
+          <w:sz w:val="21"/>
+          <w:szCs w:val="21"/>
+        </w:rPr>
       </w:pPr>
       <w:r>
+        <w:rPr>
+          <w:sz w:val="21"/>
+          <w:szCs w:val="21"/>
+        </w:rPr>
         <w:t>Best regards,</w:t>
       </w:r>
     </w:p>
     <w:p>
       <w:pPr>
         <w:spacing w:after="0"/>
+        <w:rPr>
+          <w:sz w:val="21"/>
+          <w:szCs w:val="21"/>
+        </w:rPr>
       </w:pPr>
       <w:proofErr w:type="spellStart"/>
       <w:r>
+        <w:rPr>
+          <w:sz w:val="21"/>
+          <w:szCs w:val="21"/>
+        </w:rPr>
         <w:t>Xiaoxuan</w:t>
       </w:r>
       <w:proofErr w:type="spellEnd"/>
       <w:r>
+        <w:rPr>
+          <w:sz w:val="21"/>
+          <w:szCs w:val="21"/>
+        </w:rPr>
         <w:t xml:space="preserve"> Li</w:t>
       </w:r>
     </w:p>
@@ -141,25 +211,7 @@
             <w:sz w:val="21"/>
             <w:szCs w:val="21"/>
           </w:rPr>
-          <w:t>Link</w:t>
-        </w:r>
-        <w:r>
-          <w:rPr>
-            <w:rStyle w:val="Hyperlink"/>
-            <w:rFonts w:cs="Calibri"/>
-            <w:sz w:val="21"/>
-            <w:szCs w:val="21"/>
-          </w:rPr>
-          <w:t>e</w:t>
-        </w:r>
-        <w:r>
-          <w:rPr>
-            <w:rStyle w:val="Hyperlink"/>
-            <w:rFonts w:cs="Calibri"/>
-            <w:sz w:val="21"/>
-            <w:szCs w:val="21"/>
-          </w:rPr>
-          <w:t>dIn</w:t>
+          <w:t>LinkedIn</w:t>
         </w:r>
       </w:hyperlink>
       <w:r>

</xml_diff>